<commit_message>
docs(cv): add technical lead experience for real-time audience voting platform
</commit_message>
<xml_diff>
--- a/assets/kusal-nirmala-cv.docx
+++ b/assets/kusal-nirmala-cv.docx
@@ -1,6 +1,6 @@
 
 <file path=word/document.xml><?xml version="1.0" encoding="utf-8"?>
-<w:document xmlns:wpc="http://schemas.microsoft.com/office/word/2010/wordprocessingCanvas" xmlns:mc="http://schemas.openxmlformats.org/markup-compatibility/2006" xmlns:o="urn:schemas-microsoft-com:office:office" xmlns:r="http://schemas.openxmlformats.org/officeDocument/2006/relationships" xmlns:m="http://schemas.openxmlformats.org/officeDocument/2006/math" xmlns:v="urn:schemas-microsoft-com:vml" xmlns:wp14="http://schemas.microsoft.com/office/word/2010/wordprocessingDrawing" xmlns:wp="http://schemas.openxmlformats.org/drawingml/2006/wordprocessingDrawing" xmlns:w10="urn:schemas-microsoft-com:office:word" xmlns:w="http://schemas.openxmlformats.org/wordprocessingml/2006/main" xmlns:w14="http://schemas.microsoft.com/office/word/2010/wordml" xmlns:w15="http://schemas.microsoft.com/office/word/2012/wordml" xmlns:wpg="http://schemas.microsoft.com/office/word/2010/wordprocessingGroup" xmlns:wpi="http://schemas.microsoft.com/office/word/2010/wordprocessingInk" xmlns:wne="http://schemas.microsoft.com/office/word/2006/wordml" xmlns:wps="http://schemas.microsoft.com/office/word/2010/wordprocessingShape" xmlns:cx="http://schemas.microsoft.com/office/drawing/2014/chartex" xmlns:cx1="http://schemas.microsoft.com/office/drawing/2015/9/8/chartex" xmlns:cx2="http://schemas.microsoft.com/office/drawing/2015/10/21/chartex" xmlns:cx3="http://schemas.microsoft.com/office/drawing/2016/5/9/chartex" xmlns:cx4="http://schemas.microsoft.com/office/drawing/2016/5/10/chartex" xmlns:cx5="http://schemas.microsoft.com/office/drawing/2016/5/11/chartex" xmlns:cx6="http://schemas.microsoft.com/office/drawing/2016/5/12/chartex" xmlns:cx7="http://schemas.microsoft.com/office/drawing/2016/5/13/chartex" xmlns:cx8="http://schemas.microsoft.com/office/drawing/2016/5/14/chartex" xmlns:aink="http://schemas.microsoft.com/office/drawing/2016/ink" xmlns:am3d="http://schemas.microsoft.com/office/drawing/2017/model3d" xmlns:w16cex="http://schemas.microsoft.com/office/word/2018/wordml/cex" xmlns:w16cid="http://schemas.microsoft.com/office/word/2016/wordml/cid" xmlns:w16="http://schemas.microsoft.com/office/word/2018/wordml" xmlns:w16sdtdh="http://schemas.microsoft.com/office/word/2020/wordml/sdtdatahash" xmlns:w16se="http://schemas.microsoft.com/office/word/2015/wordml/symex" mc:Ignorable="w14 w15 wp14">
+<w:document xmlns:ns1="http://schemas.openxmlformats.org/markup-compatibility/2006" xmlns:w="http://schemas.openxmlformats.org/wordprocessingml/2006/main" ns1:Ignorable="w14 w15 wp14">
   <w:body>
     <w:p>
       <w:pPr>
@@ -508,7 +508,7 @@
           <w:sz w:val="21"/>
           <w:szCs w:val="21"/>
         </w:rPr>
-        <w:t xml:space="preserve">Team Lead — Team Hades</w:t>
+        <w:t xml:space="preserve">Technical Lead — Real-Time Audience Voting Platform</w:t>
       </w:r>
       <w:r>
         <w:rPr>
@@ -519,7 +519,7 @@
           <w:sz w:val="19"/>
           <w:szCs w:val="19"/>
         </w:rPr>
-        <w:t xml:space="preserve">	SLIOT Tournament, University of Moratuwa</w:t>
+        <w:t xml:space="preserve">	NSBM Green University, 2026</w:t>
       </w:r>
     </w:p>
     <w:p>
@@ -538,7 +538,7 @@
           <w:sz w:val="20"/>
           <w:szCs w:val="20"/>
         </w:rPr>
-        <w:t xml:space="preserve">Led a student team to 2nd Runner-up (University Category) designing and building a LoRa-based tracking system for fishery boats operating beyond cellular network coverage.</w:t>
+        <w:t xml:space="preserve">Architected a zero-server real-time audience voting system and stage display with Google Cloud Firestore, supporting 200+ concurrent live voters with sub-second synchronization and zero downtime.</w:t>
       </w:r>
     </w:p>
     <w:p>
@@ -557,6 +557,93 @@
           <w:sz w:val="20"/>
           <w:szCs w:val="20"/>
         </w:rPr>
+        <w:t xml:space="preserve">Engineered a cinema-grade live stage display with GSAP 3 dynamic leaderboard physics, an SVG countdown gauge, and synthesized audio via the browser's Web Audio API to eliminate network asset downloads over auditorium Wi-Fi.</w:t>
+      </w:r>
+    </w:p>
+    <w:p>
+      <w:pPr>
+        <w:pStyle w:val="ListParagraph"/>
+        <w:numPr>
+          <w:ilvl w:val="0"/>
+          <w:numId w:val="2"/>
+        </w:numPr>
+        <w:spacing w:after="40"/>
+      </w:pPr>
+      <w:r>
+        <w:rPr>
+          <w:rFonts w:ascii="Calibri" w:cs="Calibri" w:eastAsia="Calibri" w:hAnsi="Calibri"/>
+          <w:color w:val="222222"/>
+          <w:sz w:val="20"/>
+          <w:szCs w:val="20"/>
+        </w:rPr>
+        <w:t xml:space="preserve">Implemented client-side image compression via the HTML5 Canvas API in the speaker portal, downsampling camera photos by 95%+ in-browser before upload, eliminating cloud storage costs.</w:t>
+      </w:r>
+    </w:p>
+    <w:p>
+      <w:pPr>
+        <w:tabs>
+          <w:tab w:val="right" w:pos="9360"/>
+        </w:tabs>
+        <w:spacing w:after="20" w:before="120"/>
+      </w:pPr>
+      <w:r>
+        <w:rPr>
+          <w:rFonts w:ascii="Calibri" w:cs="Calibri" w:eastAsia="Calibri" w:hAnsi="Calibri"/>
+          <w:b/>
+          <w:bCs/>
+          <w:color w:val="111111"/>
+          <w:sz w:val="21"/>
+          <w:szCs w:val="21"/>
+        </w:rPr>
+        <w:t xml:space="preserve">Team Lead — Team Hades</w:t>
+      </w:r>
+      <w:r>
+        <w:rPr>
+          <w:rFonts w:ascii="Calibri" w:cs="Calibri" w:eastAsia="Calibri" w:hAnsi="Calibri"/>
+          <w:i/>
+          <w:iCs/>
+          <w:color w:val="555555"/>
+          <w:sz w:val="19"/>
+          <w:szCs w:val="19"/>
+        </w:rPr>
+        <w:t xml:space="preserve">	SLIOT Tournament, University of Moratuwa</w:t>
+      </w:r>
+    </w:p>
+    <w:p>
+      <w:pPr>
+        <w:pStyle w:val="ListParagraph"/>
+        <w:numPr>
+          <w:ilvl w:val="0"/>
+          <w:numId w:val="2"/>
+        </w:numPr>
+        <w:spacing w:after="40"/>
+      </w:pPr>
+      <w:r>
+        <w:rPr>
+          <w:rFonts w:ascii="Calibri" w:cs="Calibri" w:eastAsia="Calibri" w:hAnsi="Calibri"/>
+          <w:color w:val="222222"/>
+          <w:sz w:val="20"/>
+          <w:szCs w:val="20"/>
+        </w:rPr>
+        <w:t xml:space="preserve">Led a student team to 2nd Runner-up (University Category) designing and building a LoRa-based tracking system for fishery boats operating beyond cellular network coverage.</w:t>
+      </w:r>
+    </w:p>
+    <w:p>
+      <w:pPr>
+        <w:pStyle w:val="ListParagraph"/>
+        <w:numPr>
+          <w:ilvl w:val="0"/>
+          <w:numId w:val="2"/>
+        </w:numPr>
+        <w:spacing w:after="40"/>
+      </w:pPr>
+      <w:r>
+        <w:rPr>
+          <w:rFonts w:ascii="Calibri" w:cs="Calibri" w:eastAsia="Calibri" w:hAnsi="Calibri"/>
+          <w:color w:val="222222"/>
+          <w:sz w:val="20"/>
+          <w:szCs w:val="20"/>
+        </w:rPr>
         <w:t xml:space="preserve">Designed and assembled a custom PCB carrying the LoRa transmitter link, taking the project from concept through to a working, competition-ready prototype.</w:t>
       </w:r>
     </w:p>
@@ -652,7 +739,7 @@
           <w:sz w:val="19"/>
           <w:szCs w:val="19"/>
         </w:rPr>
-        <w:t xml:space="preserve">Java (Enterprise), PHP, React Native, Node.js, MongoDB, PCB Design, LoRa/IoT</w:t>
+        <w:t xml:space="preserve">Java (Enterprise), PHP, React Native, Node.js, MongoDB, Cloud Firestore, GSAP, PCB Design, LoRa/IoT</w:t>
       </w:r>
     </w:p>
     <w:p>

</xml_diff>

<commit_message>
revert(cv): restore original CV docx backup
</commit_message>
<xml_diff>
--- a/assets/kusal-nirmala-cv.docx
+++ b/assets/kusal-nirmala-cv.docx
@@ -1,6 +1,6 @@
 
 <file path=word/document.xml><?xml version="1.0" encoding="utf-8"?>
-<w:document xmlns:ns1="http://schemas.openxmlformats.org/markup-compatibility/2006" xmlns:w="http://schemas.openxmlformats.org/wordprocessingml/2006/main" ns1:Ignorable="w14 w15 wp14">
+<w:document xmlns:wpc="http://schemas.microsoft.com/office/word/2010/wordprocessingCanvas" xmlns:mc="http://schemas.openxmlformats.org/markup-compatibility/2006" xmlns:o="urn:schemas-microsoft-com:office:office" xmlns:r="http://schemas.openxmlformats.org/officeDocument/2006/relationships" xmlns:m="http://schemas.openxmlformats.org/officeDocument/2006/math" xmlns:v="urn:schemas-microsoft-com:vml" xmlns:wp14="http://schemas.microsoft.com/office/word/2010/wordprocessingDrawing" xmlns:wp="http://schemas.openxmlformats.org/drawingml/2006/wordprocessingDrawing" xmlns:w10="urn:schemas-microsoft-com:office:word" xmlns:w="http://schemas.openxmlformats.org/wordprocessingml/2006/main" xmlns:w14="http://schemas.microsoft.com/office/word/2010/wordml" xmlns:w15="http://schemas.microsoft.com/office/word/2012/wordml" xmlns:wpg="http://schemas.microsoft.com/office/word/2010/wordprocessingGroup" xmlns:wpi="http://schemas.microsoft.com/office/word/2010/wordprocessingInk" xmlns:wne="http://schemas.microsoft.com/office/word/2006/wordml" xmlns:wps="http://schemas.microsoft.com/office/word/2010/wordprocessingShape" xmlns:cx="http://schemas.microsoft.com/office/drawing/2014/chartex" xmlns:cx1="http://schemas.microsoft.com/office/drawing/2015/9/8/chartex" xmlns:cx2="http://schemas.microsoft.com/office/drawing/2015/10/21/chartex" xmlns:cx3="http://schemas.microsoft.com/office/drawing/2016/5/9/chartex" xmlns:cx4="http://schemas.microsoft.com/office/drawing/2016/5/10/chartex" xmlns:cx5="http://schemas.microsoft.com/office/drawing/2016/5/11/chartex" xmlns:cx6="http://schemas.microsoft.com/office/drawing/2016/5/12/chartex" xmlns:cx7="http://schemas.microsoft.com/office/drawing/2016/5/13/chartex" xmlns:cx8="http://schemas.microsoft.com/office/drawing/2016/5/14/chartex" xmlns:aink="http://schemas.microsoft.com/office/drawing/2016/ink" xmlns:am3d="http://schemas.microsoft.com/office/drawing/2017/model3d" xmlns:w16cex="http://schemas.microsoft.com/office/word/2018/wordml/cex" xmlns:w16cid="http://schemas.microsoft.com/office/word/2016/wordml/cid" xmlns:w16="http://schemas.microsoft.com/office/word/2018/wordml" xmlns:w16sdtdh="http://schemas.microsoft.com/office/word/2020/wordml/sdtdatahash" xmlns:w16se="http://schemas.microsoft.com/office/word/2015/wordml/symex" mc:Ignorable="w14 w15 wp14">
   <w:body>
     <w:p>
       <w:pPr>
@@ -508,7 +508,7 @@
           <w:sz w:val="21"/>
           <w:szCs w:val="21"/>
         </w:rPr>
-        <w:t xml:space="preserve">Technical Lead — Real-Time Audience Voting Platform</w:t>
+        <w:t xml:space="preserve">Team Lead — Team Hades</w:t>
       </w:r>
       <w:r>
         <w:rPr>
@@ -519,7 +519,7 @@
           <w:sz w:val="19"/>
           <w:szCs w:val="19"/>
         </w:rPr>
-        <w:t xml:space="preserve">	NSBM Green University, 2026</w:t>
+        <w:t xml:space="preserve">	SLIOT Tournament, University of Moratuwa</w:t>
       </w:r>
     </w:p>
     <w:p>
@@ -538,7 +538,7 @@
           <w:sz w:val="20"/>
           <w:szCs w:val="20"/>
         </w:rPr>
-        <w:t xml:space="preserve">Architected a zero-server real-time audience voting system and stage display with Google Cloud Firestore, supporting 200+ concurrent live voters with sub-second synchronization and zero downtime.</w:t>
+        <w:t xml:space="preserve">Led a student team to 2nd Runner-up (University Category) designing and building a LoRa-based tracking system for fishery boats operating beyond cellular network coverage.</w:t>
       </w:r>
     </w:p>
     <w:p>
@@ -557,93 +557,6 @@
           <w:sz w:val="20"/>
           <w:szCs w:val="20"/>
         </w:rPr>
-        <w:t xml:space="preserve">Engineered a cinema-grade live stage display with GSAP 3 dynamic leaderboard physics, an SVG countdown gauge, and synthesized audio via the browser's Web Audio API to eliminate network asset downloads over auditorium Wi-Fi.</w:t>
-      </w:r>
-    </w:p>
-    <w:p>
-      <w:pPr>
-        <w:pStyle w:val="ListParagraph"/>
-        <w:numPr>
-          <w:ilvl w:val="0"/>
-          <w:numId w:val="2"/>
-        </w:numPr>
-        <w:spacing w:after="40"/>
-      </w:pPr>
-      <w:r>
-        <w:rPr>
-          <w:rFonts w:ascii="Calibri" w:cs="Calibri" w:eastAsia="Calibri" w:hAnsi="Calibri"/>
-          <w:color w:val="222222"/>
-          <w:sz w:val="20"/>
-          <w:szCs w:val="20"/>
-        </w:rPr>
-        <w:t xml:space="preserve">Implemented client-side image compression via the HTML5 Canvas API in the speaker portal, downsampling camera photos by 95%+ in-browser before upload, eliminating cloud storage costs.</w:t>
-      </w:r>
-    </w:p>
-    <w:p>
-      <w:pPr>
-        <w:tabs>
-          <w:tab w:val="right" w:pos="9360"/>
-        </w:tabs>
-        <w:spacing w:after="20" w:before="120"/>
-      </w:pPr>
-      <w:r>
-        <w:rPr>
-          <w:rFonts w:ascii="Calibri" w:cs="Calibri" w:eastAsia="Calibri" w:hAnsi="Calibri"/>
-          <w:b/>
-          <w:bCs/>
-          <w:color w:val="111111"/>
-          <w:sz w:val="21"/>
-          <w:szCs w:val="21"/>
-        </w:rPr>
-        <w:t xml:space="preserve">Team Lead — Team Hades</w:t>
-      </w:r>
-      <w:r>
-        <w:rPr>
-          <w:rFonts w:ascii="Calibri" w:cs="Calibri" w:eastAsia="Calibri" w:hAnsi="Calibri"/>
-          <w:i/>
-          <w:iCs/>
-          <w:color w:val="555555"/>
-          <w:sz w:val="19"/>
-          <w:szCs w:val="19"/>
-        </w:rPr>
-        <w:t xml:space="preserve">	SLIOT Tournament, University of Moratuwa</w:t>
-      </w:r>
-    </w:p>
-    <w:p>
-      <w:pPr>
-        <w:pStyle w:val="ListParagraph"/>
-        <w:numPr>
-          <w:ilvl w:val="0"/>
-          <w:numId w:val="2"/>
-        </w:numPr>
-        <w:spacing w:after="40"/>
-      </w:pPr>
-      <w:r>
-        <w:rPr>
-          <w:rFonts w:ascii="Calibri" w:cs="Calibri" w:eastAsia="Calibri" w:hAnsi="Calibri"/>
-          <w:color w:val="222222"/>
-          <w:sz w:val="20"/>
-          <w:szCs w:val="20"/>
-        </w:rPr>
-        <w:t xml:space="preserve">Led a student team to 2nd Runner-up (University Category) designing and building a LoRa-based tracking system for fishery boats operating beyond cellular network coverage.</w:t>
-      </w:r>
-    </w:p>
-    <w:p>
-      <w:pPr>
-        <w:pStyle w:val="ListParagraph"/>
-        <w:numPr>
-          <w:ilvl w:val="0"/>
-          <w:numId w:val="2"/>
-        </w:numPr>
-        <w:spacing w:after="40"/>
-      </w:pPr>
-      <w:r>
-        <w:rPr>
-          <w:rFonts w:ascii="Calibri" w:cs="Calibri" w:eastAsia="Calibri" w:hAnsi="Calibri"/>
-          <w:color w:val="222222"/>
-          <w:sz w:val="20"/>
-          <w:szCs w:val="20"/>
-        </w:rPr>
         <w:t xml:space="preserve">Designed and assembled a custom PCB carrying the LoRa transmitter link, taking the project from concept through to a working, competition-ready prototype.</w:t>
       </w:r>
     </w:p>
@@ -739,7 +652,7 @@
           <w:sz w:val="19"/>
           <w:szCs w:val="19"/>
         </w:rPr>
-        <w:t xml:space="preserve">Java (Enterprise), PHP, React Native, Node.js, MongoDB, Cloud Firestore, GSAP, PCB Design, LoRa/IoT</w:t>
+        <w:t xml:space="preserve">Java (Enterprise), PHP, React Native, Node.js, MongoDB, PCB Design, LoRa/IoT</w:t>
       </w:r>
     </w:p>
     <w:p>

</xml_diff>